<commit_message>
Update aplikasi SPD Generator
</commit_message>
<xml_diff>
--- a/output/SPD_preview.docx
+++ b/output/SPD_preview.docx
@@ -446,16 +446,19 @@
           <w:insideH w:val="single" w:sz="4" w:space="0" w:color="auto"/>
           <w:insideV w:val="single" w:sz="4" w:space="0" w:color="auto"/>
         </w:tblBorders>
+        <w:tblCellMar>
+          <w:right w:w="85" w:type="dxa"/>
+        </w:tblCellMar>
         <w:tblLook w:val="04A0" w:firstRow="1" w:lastRow="0" w:firstColumn="1" w:lastColumn="0" w:noHBand="0" w:noVBand="1"/>
       </w:tblPr>
       <w:tblGrid>
-        <w:gridCol w:w="456"/>
+        <w:gridCol w:w="432"/>
         <w:gridCol w:w="1432"/>
-        <w:gridCol w:w="1133"/>
-        <w:gridCol w:w="2098"/>
-        <w:gridCol w:w="1363"/>
-        <w:gridCol w:w="580"/>
-        <w:gridCol w:w="3530"/>
+        <w:gridCol w:w="1138"/>
+        <w:gridCol w:w="2107"/>
+        <w:gridCol w:w="1366"/>
+        <w:gridCol w:w="582"/>
+        <w:gridCol w:w="3535"/>
       </w:tblGrid>
       <w:tr>
         <w:trPr>
@@ -735,6 +738,141 @@
             <w:tcBorders>
               <w:bottom w:val="nil"/>
             </w:tcBorders>
+            <w:vAlign w:val="center"/>
+          </w:tcPr>
+          <w:tbl>
+            <w:tblPr>
+              <w:tblStyle w:val="TableGrid"/>
+              <w:tblW w:w="0" w:type="auto"/>
+              <w:tblBorders>
+                <w:top w:val="none" w:sz="0" w:space="0" w:color="auto"/>
+                <w:left w:val="none" w:sz="0" w:space="0" w:color="auto"/>
+                <w:bottom w:val="none" w:sz="0" w:space="0" w:color="auto"/>
+                <w:right w:val="none" w:sz="0" w:space="0" w:color="auto"/>
+                <w:insideH w:val="none" w:sz="0" w:space="0" w:color="auto"/>
+                <w:insideV w:val="none" w:sz="0" w:space="0" w:color="auto"/>
+              </w:tblBorders>
+              <w:tblCellMar>
+                <w:left w:w="0" w:type="dxa"/>
+                <w:right w:w="0" w:type="dxa"/>
+              </w:tblCellMar>
+              <w:tblLook w:val="04A0" w:firstRow="1" w:lastRow="0" w:firstColumn="1" w:lastColumn="0" w:noHBand="0" w:noVBand="1"/>
+            </w:tblPr>
+            <w:tblGrid>
+              <w:gridCol w:w="323"/>
+              <w:gridCol w:w="4923"/>
+            </w:tblGrid>
+            <w:tr>
+              <w:tc>
+                <w:tcPr>
+                  <w:tcW w:w="323" w:type="dxa"/>
+                </w:tcPr>
+                <w:p>
+                  <w:pPr>
+                    <w:spacing w:before="60" w:after="60"/>
+                    <w:rPr>
+                      <w:rFonts w:ascii="Arial" w:hAnsi="Arial" w:cs="Arial"/>
+                      <w:noProof/>
+                      <w:lang w:val="en-ID"/>
+                    </w:rPr>
+                  </w:pPr>
+                  <w:r>
+                    <w:rPr>
+                      <w:rFonts w:ascii="Arial" w:eastAsiaTheme="minorEastAsia" w:hAnsi="Arial" w:cs="Arial"/>
+                      <w:noProof/>
+                      <w:lang w:val="en-ID"/>
+                    </w:rPr>
+                    <w:t>a.</w:t>
+                  </w:r>
+                </w:p>
+              </w:tc>
+              <w:tc>
+                <w:tcPr>
+                  <w:tcW w:w="4923" w:type="dxa"/>
+                </w:tcPr>
+                <w:p>
+                  <w:pPr>
+                    <w:spacing w:before="60" w:after="60"/>
+                    <w:rPr>
+                      <w:rFonts w:ascii="Arial" w:hAnsi="Arial" w:cs="Arial"/>
+                      <w:noProof/>
+                      <w:lang w:val="en-ID"/>
+                    </w:rPr>
+                  </w:pPr>
+                  <w:r>
+                    <w:rPr>
+                      <w:rFonts w:ascii="Arial" w:hAnsi="Arial" w:cs="Arial"/>
+                      <w:noProof/>
+                      <w:lang w:val="en-ID"/>
+                    </w:rPr>
+                    <w:t>III/a</w:t>
+                  </w:r>
+                </w:p>
+              </w:tc>
+            </w:tr>
+          </w:tbl>
+          <w:p>
+            <w:pPr>
+              <w:spacing w:before="60" w:after="60"/>
+              <w:rPr>
+                <w:rFonts w:ascii="Arial" w:hAnsi="Arial" w:cs="Arial"/>
+                <w:lang w:val="en-ID"/>
+              </w:rPr>
+            </w:pPr>
+          </w:p>
+        </w:tc>
+      </w:tr>
+      <w:tr>
+        <w:tc>
+          <w:tcPr>
+            <w:tcW w:w="417" w:type="dxa"/>
+            <w:tcBorders>
+              <w:top w:val="nil"/>
+              <w:bottom w:val="nil"/>
+            </w:tcBorders>
+          </w:tcPr>
+          <w:p>
+            <w:pPr>
+              <w:spacing w:before="60" w:after="60"/>
+              <w:rPr>
+                <w:rFonts w:ascii="Arial" w:hAnsi="Arial" w:cs="Arial"/>
+              </w:rPr>
+            </w:pPr>
+          </w:p>
+        </w:tc>
+        <w:tc>
+          <w:tcPr>
+            <w:tcW w:w="4686" w:type="dxa"/>
+            <w:gridSpan w:val="3"/>
+            <w:tcBorders>
+              <w:top w:val="nil"/>
+              <w:bottom w:val="nil"/>
+            </w:tcBorders>
+          </w:tcPr>
+          <w:p>
+            <w:pPr>
+              <w:spacing w:before="60" w:after="60"/>
+              <w:rPr>
+                <w:rFonts w:ascii="Arial" w:hAnsi="Arial" w:cs="Arial"/>
+              </w:rPr>
+            </w:pPr>
+            <w:r>
+              <w:rPr>
+                <w:rFonts w:ascii="Arial" w:hAnsi="Arial" w:cs="Arial"/>
+              </w:rPr>
+              <w:t>b. Jabatan/Instansi</w:t>
+            </w:r>
+          </w:p>
+        </w:tc>
+        <w:tc>
+          <w:tcPr>
+            <w:tcW w:w="5489" w:type="dxa"/>
+            <w:gridSpan w:val="3"/>
+            <w:tcBorders>
+              <w:top w:val="nil"/>
+              <w:bottom w:val="nil"/>
+            </w:tcBorders>
+            <w:vAlign w:val="center"/>
           </w:tcPr>
           <w:tbl>
             <w:tblPr>
@@ -754,152 +892,17 @@
               <w:tblLook w:val="04A0" w:firstRow="1" w:lastRow="0" w:firstColumn="1" w:lastColumn="0" w:noHBand="0" w:noVBand="1"/>
             </w:tblPr>
             <w:tblGrid>
-              <w:gridCol w:w="309"/>
-              <w:gridCol w:w="4937"/>
+              <w:gridCol w:w="325"/>
+              <w:gridCol w:w="4921"/>
             </w:tblGrid>
             <w:tr>
               <w:tc>
                 <w:tcPr>
-                  <w:tcW w:w="309" w:type="dxa"/>
+                  <w:tcW w:w="325" w:type="dxa"/>
                 </w:tcPr>
                 <w:p>
                   <w:pPr>
                     <w:spacing w:before="60" w:after="60"/>
-                    <w:jc w:val="both"/>
-                    <w:rPr>
-                      <w:rFonts w:ascii="Arial" w:hAnsi="Arial" w:cs="Arial"/>
-                      <w:noProof/>
-                      <w:lang w:val="en-ID"/>
-                    </w:rPr>
-                  </w:pPr>
-                  <w:r>
-                    <w:rPr>
-                      <w:rFonts w:ascii="Arial" w:eastAsiaTheme="minorEastAsia" w:hAnsi="Arial" w:cs="Arial"/>
-                      <w:noProof/>
-                      <w:lang w:val="en-ID"/>
-                    </w:rPr>
-                    <w:t>a.</w:t>
-                  </w:r>
-                </w:p>
-              </w:tc>
-              <w:tc>
-                <w:tcPr>
-                  <w:tcW w:w="4937" w:type="dxa"/>
-                </w:tcPr>
-                <w:p>
-                  <w:pPr>
-                    <w:spacing w:before="60" w:after="60"/>
-                    <w:jc w:val="both"/>
-                    <w:rPr>
-                      <w:rFonts w:ascii="Arial" w:hAnsi="Arial" w:cs="Arial"/>
-                      <w:noProof/>
-                      <w:lang w:val="en-ID"/>
-                    </w:rPr>
-                  </w:pPr>
-                  <w:r>
-                    <w:rPr>
-                      <w:rFonts w:ascii="Arial" w:hAnsi="Arial" w:cs="Arial"/>
-                      <w:noProof/>
-                      <w:lang w:val="en-ID"/>
-                    </w:rPr>
-                    <w:t>III/a</w:t>
-                  </w:r>
-                </w:p>
-              </w:tc>
-            </w:tr>
-          </w:tbl>
-          <w:p>
-            <w:pPr>
-              <w:spacing w:before="60" w:after="60"/>
-              <w:rPr>
-                <w:rFonts w:ascii="Arial" w:hAnsi="Arial" w:cs="Arial"/>
-                <w:lang w:val="en-ID"/>
-              </w:rPr>
-            </w:pPr>
-          </w:p>
-        </w:tc>
-      </w:tr>
-      <w:tr>
-        <w:tc>
-          <w:tcPr>
-            <w:tcW w:w="417" w:type="dxa"/>
-            <w:tcBorders>
-              <w:top w:val="nil"/>
-              <w:bottom w:val="nil"/>
-            </w:tcBorders>
-          </w:tcPr>
-          <w:p>
-            <w:pPr>
-              <w:spacing w:before="60" w:after="60"/>
-              <w:rPr>
-                <w:rFonts w:ascii="Arial" w:hAnsi="Arial" w:cs="Arial"/>
-              </w:rPr>
-            </w:pPr>
-          </w:p>
-        </w:tc>
-        <w:tc>
-          <w:tcPr>
-            <w:tcW w:w="4686" w:type="dxa"/>
-            <w:gridSpan w:val="3"/>
-            <w:tcBorders>
-              <w:top w:val="nil"/>
-              <w:bottom w:val="nil"/>
-            </w:tcBorders>
-          </w:tcPr>
-          <w:p>
-            <w:pPr>
-              <w:spacing w:before="60" w:after="60"/>
-              <w:rPr>
-                <w:rFonts w:ascii="Arial" w:hAnsi="Arial" w:cs="Arial"/>
-              </w:rPr>
-            </w:pPr>
-            <w:r>
-              <w:rPr>
-                <w:rFonts w:ascii="Arial" w:hAnsi="Arial" w:cs="Arial"/>
-              </w:rPr>
-              <w:t>b. Jabatan/Instansi</w:t>
-            </w:r>
-          </w:p>
-        </w:tc>
-        <w:tc>
-          <w:tcPr>
-            <w:tcW w:w="5489" w:type="dxa"/>
-            <w:gridSpan w:val="3"/>
-            <w:tcBorders>
-              <w:top w:val="nil"/>
-              <w:bottom w:val="nil"/>
-            </w:tcBorders>
-          </w:tcPr>
-          <w:tbl>
-            <w:tblPr>
-              <w:tblStyle w:val="TableGrid"/>
-              <w:tblW w:w="0" w:type="auto"/>
-              <w:tblBorders>
-                <w:top w:val="none" w:sz="0" w:space="0" w:color="auto"/>
-                <w:left w:val="none" w:sz="0" w:space="0" w:color="auto"/>
-                <w:bottom w:val="none" w:sz="0" w:space="0" w:color="auto"/>
-                <w:right w:val="none" w:sz="0" w:space="0" w:color="auto"/>
-                <w:insideH w:val="none" w:sz="0" w:space="0" w:color="auto"/>
-                <w:insideV w:val="none" w:sz="0" w:space="0" w:color="auto"/>
-              </w:tblBorders>
-              <w:tblCellMar>
-                <w:left w:w="0" w:type="dxa"/>
-              </w:tblCellMar>
-              <w:tblLook w:val="04A0" w:firstRow="1" w:lastRow="0" w:firstColumn="1" w:lastColumn="0" w:noHBand="0" w:noVBand="1"/>
-            </w:tblPr>
-            <w:tblGrid>
-              <w:gridCol w:w="309"/>
-              <w:gridCol w:w="4937"/>
-            </w:tblGrid>
-            <w:tr>
-              <w:tc>
-                <w:tcPr>
-                  <w:tcW w:w="309" w:type="dxa"/>
-                </w:tcPr>
-                <w:p>
-                  <w:pPr>
-                    <w:spacing w:before="60" w:after="60"/>
-                    <w:jc w:val="both"/>
                     <w:rPr>
                       <w:rFonts w:ascii="Arial" w:hAnsi="Arial" w:cs="Arial"/>
                       <w:noProof/>
@@ -926,12 +929,11 @@
               </w:tc>
               <w:tc>
                 <w:tcPr>
-                  <w:tcW w:w="4937" w:type="dxa"/>
+                  <w:tcW w:w="4921" w:type="dxa"/>
                 </w:tcPr>
                 <w:p>
                   <w:pPr>
                     <w:spacing w:before="60" w:after="60"/>
-                    <w:jc w:val="both"/>
                     <w:rPr>
                       <w:rFonts w:ascii="Arial" w:hAnsi="Arial" w:cs="Arial"/>
                       <w:noProof/>
@@ -954,7 +956,6 @@
             <w:pPr>
               <w:spacing w:before="60" w:after="60"/>
               <w:ind w:hanging="318"/>
-              <w:jc w:val="both"/>
               <w:rPr>
                 <w:rFonts w:ascii="Arial" w:hAnsi="Arial" w:cs="Arial"/>
                 <w:noProof/>
@@ -1017,6 +1018,7 @@
             <w:tcBorders>
               <w:top w:val="nil"/>
             </w:tcBorders>
+            <w:vAlign w:val="center"/>
           </w:tcPr>
           <w:tbl>
             <w:tblPr>
@@ -1036,18 +1038,17 @@
               <w:tblLook w:val="04A0" w:firstRow="1" w:lastRow="0" w:firstColumn="1" w:lastColumn="0" w:noHBand="0" w:noVBand="1"/>
             </w:tblPr>
             <w:tblGrid>
-              <w:gridCol w:w="309"/>
-              <w:gridCol w:w="4937"/>
+              <w:gridCol w:w="325"/>
+              <w:gridCol w:w="4921"/>
             </w:tblGrid>
             <w:tr>
               <w:tc>
                 <w:tcPr>
-                  <w:tcW w:w="309" w:type="dxa"/>
+                  <w:tcW w:w="325" w:type="dxa"/>
                 </w:tcPr>
                 <w:p>
                   <w:pPr>
                     <w:spacing w:before="60" w:after="60"/>
-                    <w:jc w:val="both"/>
                     <w:rPr>
                       <w:rFonts w:ascii="Arial" w:hAnsi="Arial" w:cs="Arial"/>
                       <w:noProof/>
@@ -1070,12 +1071,11 @@
               </w:tc>
               <w:tc>
                 <w:tcPr>
-                  <w:tcW w:w="4937" w:type="dxa"/>
+                  <w:tcW w:w="4921" w:type="dxa"/>
                 </w:tcPr>
                 <w:p>
                   <w:pPr>
                     <w:spacing w:before="60" w:after="60"/>
-                    <w:jc w:val="both"/>
                     <w:rPr>
                       <w:rFonts w:ascii="Arial" w:hAnsi="Arial" w:cs="Arial"/>
                       <w:noProof/>
@@ -1168,7 +1168,7 @@
                 <w:rFonts w:ascii="Arial" w:hAnsi="Arial" w:cs="Arial"/>
                 <w:lang w:val="en-ID"/>
               </w:rPr>
-              <w:t>monitoring</w:t>
+              <w:t>wafw</w:t>
             </w:r>
             <w:proofErr w:type="spellStart"/>
             <w:r>
@@ -1668,7 +1668,7 @@
               </w:rPr>
               <w:t>b.</w:t>
               <w:tab/>
-              <w:t>1 September 2026</w:t>
+              <w:t>2 September 2026</w:t>
             </w:r>
             <w:r>
               <w:rPr>
@@ -1773,7 +1773,7 @@
               <w:rPr>
                 <w:rFonts w:ascii="Arial" w:hAnsi="Arial" w:cs="Arial"/>
               </w:rPr>
-              <w:t>c.   2 September 2026</w:t>
+              <w:t>c.   3 September 2026</w:t>
             </w:r>
             <w:r>
               <w:rPr>
@@ -2358,7 +2358,7 @@
         <w:rPr>
           <w:rFonts w:ascii="Arial" w:hAnsi="Arial" w:cs="Arial"/>
         </w:rPr>
-        <w:t>Pada tanggal   :  1 September 2026</w:t>
+        <w:t>Pada tanggal   :  2 September 2026</w:t>
       </w:r>
       <w:r>
         <w:rPr>
@@ -3118,7 +3118,7 @@
                 <w:rFonts w:ascii="Arial" w:hAnsi="Arial" w:cs="Arial"/>
                 <w:lang w:val="en-US"/>
               </w:rPr>
-              <w:t>Pada Tanggal         : 1 September 2026</w:t>
+              <w:t>Pada Tanggal         : 2 September 2026</w:t>
             </w:r>
             <w:proofErr w:type="spellStart"/>
             <w:r>
@@ -3495,7 +3495,7 @@
               </w:rPr>
               <w:t xml:space="preserve">      Pada Tanggal</w:t>
               <w:tab/>
-              <w:t>: 1 September 2026</w:t>
+              <w:t>: 2 September 2026</w:t>
             </w:r>
             <w:proofErr w:type="spellStart"/>
             <w:r>
@@ -3610,7 +3610,7 @@
               </w:rPr>
               <w:t>Pada tanggal</w:t>
               <w:tab/>
-              <w:t>: 2 September 2026</w:t>
+              <w:t>: 3 September 2026</w:t>
             </w:r>
             <w:proofErr w:type="spellStart"/>
             <w:r>
@@ -4354,7 +4354,7 @@
               <w:tab/>
               <w:t>Pada Tanggal</w:t>
               <w:tab/>
-              <w:t>: 2 September 2026</w:t>
+              <w:t>: 3 September 2026</w:t>
             </w:r>
             <w:r>
               <w:rPr>

</xml_diff>